<commit_message>
Adding SMZ and SDZ
</commit_message>
<xml_diff>
--- a/Sulfamerazine/Sulfamerazine.docx
+++ b/Sulfamerazine/Sulfamerazine.docx
@@ -68,10 +68,10 @@
             <v:path o:extrusionok="f" gradientshapeok="t" o:connecttype="rect"/>
             <o:lock v:ext="edit" aspectratio="t"/>
           </v:shapetype>
-          <v:shape id="_x0000_i1025" type="#_x0000_t75" style="width:154.7pt;height:93.45pt" o:ole="">
+          <v:shape id="_x0000_i1025" type="#_x0000_t75" style="width:154.5pt;height:93.75pt" o:ole="">
             <v:imagedata r:id="rId6" o:title=""/>
           </v:shape>
-          <o:OLEObject Type="Embed" ProgID="ACD.ChemSketch.20" ShapeID="_x0000_i1025" DrawAspect="Content" ObjectID="_1831185242" r:id="rId7"/>
+          <o:OLEObject Type="Embed" ProgID="ACD.ChemSketch.20" ShapeID="_x0000_i1025" DrawAspect="Content" ObjectID="_1845108895" r:id="rId7"/>
         </w:object>
       </w:r>
     </w:p>
@@ -1438,7 +1438,7 @@
               </w:rPr>
               <w:lastRenderedPageBreak/>
               <w:drawing>
-                <wp:inline distT="0" distB="0" distL="0" distR="0" wp14:anchorId="12C00607" wp14:editId="15EBCF71">
+                <wp:inline distT="0" distB="0" distL="0" distR="0" wp14:anchorId="12C00607" wp14:editId="2552FFC7">
                   <wp:extent cx="4320000" cy="3136126"/>
                   <wp:effectExtent l="0" t="0" r="4445" b="7620"/>
                   <wp:docPr id="842856575" name="Picture 1"/>
@@ -2058,6 +2058,9 @@
         <w:tc>
           <w:tcPr>
             <w:tcW w:w="1386" w:type="dxa"/>
+            <w:tcBorders>
+              <w:bottom w:val="single" w:sz="24" w:space="0" w:color="auto"/>
+            </w:tcBorders>
             <w:vAlign w:val="bottom"/>
           </w:tcPr>
           <w:p>
@@ -2079,6 +2082,9 @@
         <w:tc>
           <w:tcPr>
             <w:tcW w:w="939" w:type="dxa"/>
+            <w:tcBorders>
+              <w:bottom w:val="single" w:sz="24" w:space="0" w:color="auto"/>
+            </w:tcBorders>
             <w:vAlign w:val="bottom"/>
           </w:tcPr>
           <w:p>
@@ -2099,6 +2105,9 @@
         <w:tc>
           <w:tcPr>
             <w:tcW w:w="819" w:type="dxa"/>
+            <w:tcBorders>
+              <w:bottom w:val="single" w:sz="24" w:space="0" w:color="auto"/>
+            </w:tcBorders>
             <w:vAlign w:val="bottom"/>
           </w:tcPr>
           <w:p>
@@ -2119,6 +2128,9 @@
         <w:tc>
           <w:tcPr>
             <w:tcW w:w="943" w:type="dxa"/>
+            <w:tcBorders>
+              <w:bottom w:val="single" w:sz="24" w:space="0" w:color="auto"/>
+            </w:tcBorders>
             <w:vAlign w:val="bottom"/>
           </w:tcPr>
           <w:p>
@@ -2139,6 +2151,9 @@
         <w:tc>
           <w:tcPr>
             <w:tcW w:w="908" w:type="dxa"/>
+            <w:tcBorders>
+              <w:bottom w:val="single" w:sz="24" w:space="0" w:color="auto"/>
+            </w:tcBorders>
             <w:vAlign w:val="bottom"/>
           </w:tcPr>
           <w:p>
@@ -2159,6 +2174,9 @@
         <w:tc>
           <w:tcPr>
             <w:tcW w:w="943" w:type="dxa"/>
+            <w:tcBorders>
+              <w:bottom w:val="single" w:sz="24" w:space="0" w:color="auto"/>
+            </w:tcBorders>
             <w:vAlign w:val="bottom"/>
           </w:tcPr>
           <w:p>
@@ -2179,6 +2197,9 @@
         <w:tc>
           <w:tcPr>
             <w:tcW w:w="836" w:type="dxa"/>
+            <w:tcBorders>
+              <w:bottom w:val="single" w:sz="24" w:space="0" w:color="auto"/>
+            </w:tcBorders>
             <w:vAlign w:val="bottom"/>
           </w:tcPr>
           <w:p>
@@ -2199,6 +2220,9 @@
         <w:tc>
           <w:tcPr>
             <w:tcW w:w="907" w:type="dxa"/>
+            <w:tcBorders>
+              <w:bottom w:val="single" w:sz="24" w:space="0" w:color="auto"/>
+            </w:tcBorders>
             <w:vAlign w:val="bottom"/>
           </w:tcPr>
           <w:p>
@@ -2219,6 +2243,9 @@
         <w:tc>
           <w:tcPr>
             <w:tcW w:w="853" w:type="dxa"/>
+            <w:tcBorders>
+              <w:bottom w:val="single" w:sz="24" w:space="0" w:color="auto"/>
+            </w:tcBorders>
             <w:vAlign w:val="bottom"/>
           </w:tcPr>
           <w:p>
@@ -2239,6 +2266,9 @@
         <w:tc>
           <w:tcPr>
             <w:tcW w:w="981" w:type="dxa"/>
+            <w:tcBorders>
+              <w:bottom w:val="single" w:sz="24" w:space="0" w:color="auto"/>
+            </w:tcBorders>
             <w:vAlign w:val="bottom"/>
           </w:tcPr>
           <w:p>
@@ -2259,6 +2289,9 @@
         <w:tc>
           <w:tcPr>
             <w:tcW w:w="941" w:type="dxa"/>
+            <w:tcBorders>
+              <w:bottom w:val="single" w:sz="24" w:space="0" w:color="auto"/>
+            </w:tcBorders>
           </w:tcPr>
           <w:p>
             <w:pPr>
@@ -2281,6 +2314,11 @@
         <w:tc>
           <w:tcPr>
             <w:tcW w:w="1386" w:type="dxa"/>
+            <w:tcBorders>
+              <w:top w:val="single" w:sz="24" w:space="0" w:color="auto"/>
+              <w:left w:val="single" w:sz="24" w:space="0" w:color="auto"/>
+              <w:bottom w:val="single" w:sz="24" w:space="0" w:color="auto"/>
+            </w:tcBorders>
             <w:shd w:val="clear" w:color="auto" w:fill="C5E0B3" w:themeFill="accent6" w:themeFillTint="66"/>
             <w:vAlign w:val="bottom"/>
           </w:tcPr>
@@ -2303,6 +2341,10 @@
         <w:tc>
           <w:tcPr>
             <w:tcW w:w="939" w:type="dxa"/>
+            <w:tcBorders>
+              <w:top w:val="single" w:sz="24" w:space="0" w:color="auto"/>
+              <w:bottom w:val="single" w:sz="24" w:space="0" w:color="auto"/>
+            </w:tcBorders>
             <w:shd w:val="clear" w:color="auto" w:fill="C5E0B3" w:themeFill="accent6" w:themeFillTint="66"/>
             <w:vAlign w:val="bottom"/>
           </w:tcPr>
@@ -2326,6 +2368,10 @@
         <w:tc>
           <w:tcPr>
             <w:tcW w:w="819" w:type="dxa"/>
+            <w:tcBorders>
+              <w:top w:val="single" w:sz="24" w:space="0" w:color="auto"/>
+              <w:bottom w:val="single" w:sz="24" w:space="0" w:color="auto"/>
+            </w:tcBorders>
             <w:shd w:val="clear" w:color="auto" w:fill="C5E0B3" w:themeFill="accent6" w:themeFillTint="66"/>
             <w:vAlign w:val="bottom"/>
           </w:tcPr>
@@ -2347,6 +2393,10 @@
         <w:tc>
           <w:tcPr>
             <w:tcW w:w="943" w:type="dxa"/>
+            <w:tcBorders>
+              <w:top w:val="single" w:sz="24" w:space="0" w:color="auto"/>
+              <w:bottom w:val="single" w:sz="24" w:space="0" w:color="auto"/>
+            </w:tcBorders>
             <w:shd w:val="clear" w:color="auto" w:fill="C5E0B3" w:themeFill="accent6" w:themeFillTint="66"/>
             <w:vAlign w:val="bottom"/>
           </w:tcPr>
@@ -2368,6 +2418,10 @@
         <w:tc>
           <w:tcPr>
             <w:tcW w:w="908" w:type="dxa"/>
+            <w:tcBorders>
+              <w:top w:val="single" w:sz="24" w:space="0" w:color="auto"/>
+              <w:bottom w:val="single" w:sz="24" w:space="0" w:color="auto"/>
+            </w:tcBorders>
             <w:shd w:val="clear" w:color="auto" w:fill="C5E0B3" w:themeFill="accent6" w:themeFillTint="66"/>
             <w:vAlign w:val="bottom"/>
           </w:tcPr>
@@ -2389,6 +2443,10 @@
         <w:tc>
           <w:tcPr>
             <w:tcW w:w="943" w:type="dxa"/>
+            <w:tcBorders>
+              <w:top w:val="single" w:sz="24" w:space="0" w:color="auto"/>
+              <w:bottom w:val="single" w:sz="24" w:space="0" w:color="auto"/>
+            </w:tcBorders>
             <w:shd w:val="clear" w:color="auto" w:fill="C5E0B3" w:themeFill="accent6" w:themeFillTint="66"/>
             <w:vAlign w:val="bottom"/>
           </w:tcPr>
@@ -2410,6 +2468,10 @@
         <w:tc>
           <w:tcPr>
             <w:tcW w:w="836" w:type="dxa"/>
+            <w:tcBorders>
+              <w:top w:val="single" w:sz="24" w:space="0" w:color="auto"/>
+              <w:bottom w:val="single" w:sz="24" w:space="0" w:color="auto"/>
+            </w:tcBorders>
             <w:shd w:val="clear" w:color="auto" w:fill="C5E0B3" w:themeFill="accent6" w:themeFillTint="66"/>
             <w:vAlign w:val="bottom"/>
           </w:tcPr>
@@ -2431,6 +2493,10 @@
         <w:tc>
           <w:tcPr>
             <w:tcW w:w="907" w:type="dxa"/>
+            <w:tcBorders>
+              <w:top w:val="single" w:sz="24" w:space="0" w:color="auto"/>
+              <w:bottom w:val="single" w:sz="24" w:space="0" w:color="auto"/>
+            </w:tcBorders>
             <w:shd w:val="clear" w:color="auto" w:fill="C5E0B3" w:themeFill="accent6" w:themeFillTint="66"/>
             <w:vAlign w:val="bottom"/>
           </w:tcPr>
@@ -2452,6 +2518,10 @@
         <w:tc>
           <w:tcPr>
             <w:tcW w:w="853" w:type="dxa"/>
+            <w:tcBorders>
+              <w:top w:val="single" w:sz="24" w:space="0" w:color="auto"/>
+              <w:bottom w:val="single" w:sz="24" w:space="0" w:color="auto"/>
+            </w:tcBorders>
             <w:shd w:val="clear" w:color="auto" w:fill="C5E0B3" w:themeFill="accent6" w:themeFillTint="66"/>
             <w:vAlign w:val="bottom"/>
           </w:tcPr>
@@ -2473,6 +2543,10 @@
         <w:tc>
           <w:tcPr>
             <w:tcW w:w="981" w:type="dxa"/>
+            <w:tcBorders>
+              <w:top w:val="single" w:sz="24" w:space="0" w:color="auto"/>
+              <w:bottom w:val="single" w:sz="24" w:space="0" w:color="auto"/>
+            </w:tcBorders>
             <w:shd w:val="clear" w:color="auto" w:fill="C5E0B3" w:themeFill="accent6" w:themeFillTint="66"/>
             <w:vAlign w:val="bottom"/>
           </w:tcPr>
@@ -2494,6 +2568,11 @@
         <w:tc>
           <w:tcPr>
             <w:tcW w:w="941" w:type="dxa"/>
+            <w:tcBorders>
+              <w:top w:val="single" w:sz="24" w:space="0" w:color="auto"/>
+              <w:bottom w:val="single" w:sz="24" w:space="0" w:color="auto"/>
+              <w:right w:val="single" w:sz="24" w:space="0" w:color="auto"/>
+            </w:tcBorders>
             <w:shd w:val="clear" w:color="auto" w:fill="C5E0B3" w:themeFill="accent6" w:themeFillTint="66"/>
           </w:tcPr>
           <w:p>
@@ -2526,6 +2605,11 @@
         <w:tc>
           <w:tcPr>
             <w:tcW w:w="1386" w:type="dxa"/>
+            <w:tcBorders>
+              <w:top w:val="single" w:sz="24" w:space="0" w:color="auto"/>
+              <w:left w:val="single" w:sz="24" w:space="0" w:color="auto"/>
+              <w:bottom w:val="single" w:sz="24" w:space="0" w:color="auto"/>
+            </w:tcBorders>
             <w:shd w:val="clear" w:color="auto" w:fill="FFE599" w:themeFill="accent4" w:themeFillTint="66"/>
             <w:vAlign w:val="bottom"/>
           </w:tcPr>
@@ -2548,6 +2632,10 @@
         <w:tc>
           <w:tcPr>
             <w:tcW w:w="939" w:type="dxa"/>
+            <w:tcBorders>
+              <w:top w:val="single" w:sz="24" w:space="0" w:color="auto"/>
+              <w:bottom w:val="single" w:sz="24" w:space="0" w:color="auto"/>
+            </w:tcBorders>
             <w:shd w:val="clear" w:color="auto" w:fill="FFE599" w:themeFill="accent4" w:themeFillTint="66"/>
             <w:vAlign w:val="bottom"/>
           </w:tcPr>
@@ -2569,6 +2657,10 @@
         <w:tc>
           <w:tcPr>
             <w:tcW w:w="819" w:type="dxa"/>
+            <w:tcBorders>
+              <w:top w:val="single" w:sz="24" w:space="0" w:color="auto"/>
+              <w:bottom w:val="single" w:sz="24" w:space="0" w:color="auto"/>
+            </w:tcBorders>
             <w:shd w:val="clear" w:color="auto" w:fill="FFE599" w:themeFill="accent4" w:themeFillTint="66"/>
             <w:vAlign w:val="bottom"/>
           </w:tcPr>
@@ -2590,6 +2682,10 @@
         <w:tc>
           <w:tcPr>
             <w:tcW w:w="943" w:type="dxa"/>
+            <w:tcBorders>
+              <w:top w:val="single" w:sz="24" w:space="0" w:color="auto"/>
+              <w:bottom w:val="single" w:sz="24" w:space="0" w:color="auto"/>
+            </w:tcBorders>
             <w:shd w:val="clear" w:color="auto" w:fill="FFE599" w:themeFill="accent4" w:themeFillTint="66"/>
             <w:vAlign w:val="bottom"/>
           </w:tcPr>
@@ -2611,6 +2707,10 @@
         <w:tc>
           <w:tcPr>
             <w:tcW w:w="908" w:type="dxa"/>
+            <w:tcBorders>
+              <w:top w:val="single" w:sz="24" w:space="0" w:color="auto"/>
+              <w:bottom w:val="single" w:sz="24" w:space="0" w:color="auto"/>
+            </w:tcBorders>
             <w:shd w:val="clear" w:color="auto" w:fill="FFE599" w:themeFill="accent4" w:themeFillTint="66"/>
             <w:vAlign w:val="bottom"/>
           </w:tcPr>
@@ -2632,6 +2732,10 @@
         <w:tc>
           <w:tcPr>
             <w:tcW w:w="943" w:type="dxa"/>
+            <w:tcBorders>
+              <w:top w:val="single" w:sz="24" w:space="0" w:color="auto"/>
+              <w:bottom w:val="single" w:sz="24" w:space="0" w:color="auto"/>
+            </w:tcBorders>
             <w:shd w:val="clear" w:color="auto" w:fill="FFE599" w:themeFill="accent4" w:themeFillTint="66"/>
             <w:vAlign w:val="bottom"/>
           </w:tcPr>
@@ -2653,6 +2757,10 @@
         <w:tc>
           <w:tcPr>
             <w:tcW w:w="836" w:type="dxa"/>
+            <w:tcBorders>
+              <w:top w:val="single" w:sz="24" w:space="0" w:color="auto"/>
+              <w:bottom w:val="single" w:sz="24" w:space="0" w:color="auto"/>
+            </w:tcBorders>
             <w:shd w:val="clear" w:color="auto" w:fill="FFE599" w:themeFill="accent4" w:themeFillTint="66"/>
             <w:vAlign w:val="bottom"/>
           </w:tcPr>
@@ -2674,6 +2782,10 @@
         <w:tc>
           <w:tcPr>
             <w:tcW w:w="907" w:type="dxa"/>
+            <w:tcBorders>
+              <w:top w:val="single" w:sz="24" w:space="0" w:color="auto"/>
+              <w:bottom w:val="single" w:sz="24" w:space="0" w:color="auto"/>
+            </w:tcBorders>
             <w:shd w:val="clear" w:color="auto" w:fill="FFE599" w:themeFill="accent4" w:themeFillTint="66"/>
             <w:vAlign w:val="bottom"/>
           </w:tcPr>
@@ -2695,6 +2807,10 @@
         <w:tc>
           <w:tcPr>
             <w:tcW w:w="853" w:type="dxa"/>
+            <w:tcBorders>
+              <w:top w:val="single" w:sz="24" w:space="0" w:color="auto"/>
+              <w:bottom w:val="single" w:sz="24" w:space="0" w:color="auto"/>
+            </w:tcBorders>
             <w:shd w:val="clear" w:color="auto" w:fill="FFE599" w:themeFill="accent4" w:themeFillTint="66"/>
             <w:vAlign w:val="bottom"/>
           </w:tcPr>
@@ -2716,6 +2832,10 @@
         <w:tc>
           <w:tcPr>
             <w:tcW w:w="981" w:type="dxa"/>
+            <w:tcBorders>
+              <w:top w:val="single" w:sz="24" w:space="0" w:color="auto"/>
+              <w:bottom w:val="single" w:sz="24" w:space="0" w:color="auto"/>
+            </w:tcBorders>
             <w:shd w:val="clear" w:color="auto" w:fill="FFE599" w:themeFill="accent4" w:themeFillTint="66"/>
             <w:vAlign w:val="bottom"/>
           </w:tcPr>
@@ -2737,6 +2857,11 @@
         <w:tc>
           <w:tcPr>
             <w:tcW w:w="941" w:type="dxa"/>
+            <w:tcBorders>
+              <w:top w:val="single" w:sz="24" w:space="0" w:color="auto"/>
+              <w:bottom w:val="single" w:sz="24" w:space="0" w:color="auto"/>
+              <w:right w:val="single" w:sz="24" w:space="0" w:color="auto"/>
+            </w:tcBorders>
             <w:shd w:val="clear" w:color="auto" w:fill="FFE599" w:themeFill="accent4" w:themeFillTint="66"/>
           </w:tcPr>
           <w:p>
@@ -2767,6 +2892,11 @@
         <w:tc>
           <w:tcPr>
             <w:tcW w:w="1386" w:type="dxa"/>
+            <w:tcBorders>
+              <w:top w:val="single" w:sz="24" w:space="0" w:color="auto"/>
+              <w:left w:val="single" w:sz="24" w:space="0" w:color="auto"/>
+              <w:bottom w:val="single" w:sz="24" w:space="0" w:color="auto"/>
+            </w:tcBorders>
             <w:shd w:val="clear" w:color="auto" w:fill="B4C6E7" w:themeFill="accent1" w:themeFillTint="66"/>
             <w:vAlign w:val="bottom"/>
           </w:tcPr>
@@ -2789,6 +2919,10 @@
         <w:tc>
           <w:tcPr>
             <w:tcW w:w="939" w:type="dxa"/>
+            <w:tcBorders>
+              <w:top w:val="single" w:sz="24" w:space="0" w:color="auto"/>
+              <w:bottom w:val="single" w:sz="24" w:space="0" w:color="auto"/>
+            </w:tcBorders>
             <w:shd w:val="clear" w:color="auto" w:fill="B4C6E7" w:themeFill="accent1" w:themeFillTint="66"/>
             <w:vAlign w:val="bottom"/>
           </w:tcPr>
@@ -2810,6 +2944,10 @@
         <w:tc>
           <w:tcPr>
             <w:tcW w:w="819" w:type="dxa"/>
+            <w:tcBorders>
+              <w:top w:val="single" w:sz="24" w:space="0" w:color="auto"/>
+              <w:bottom w:val="single" w:sz="24" w:space="0" w:color="auto"/>
+            </w:tcBorders>
             <w:shd w:val="clear" w:color="auto" w:fill="B4C6E7" w:themeFill="accent1" w:themeFillTint="66"/>
             <w:vAlign w:val="bottom"/>
           </w:tcPr>
@@ -2831,6 +2969,10 @@
         <w:tc>
           <w:tcPr>
             <w:tcW w:w="943" w:type="dxa"/>
+            <w:tcBorders>
+              <w:top w:val="single" w:sz="24" w:space="0" w:color="auto"/>
+              <w:bottom w:val="single" w:sz="24" w:space="0" w:color="auto"/>
+            </w:tcBorders>
             <w:shd w:val="clear" w:color="auto" w:fill="B4C6E7" w:themeFill="accent1" w:themeFillTint="66"/>
             <w:vAlign w:val="bottom"/>
           </w:tcPr>
@@ -2852,6 +2994,10 @@
         <w:tc>
           <w:tcPr>
             <w:tcW w:w="908" w:type="dxa"/>
+            <w:tcBorders>
+              <w:top w:val="single" w:sz="24" w:space="0" w:color="auto"/>
+              <w:bottom w:val="single" w:sz="24" w:space="0" w:color="auto"/>
+            </w:tcBorders>
             <w:shd w:val="clear" w:color="auto" w:fill="B4C6E7" w:themeFill="accent1" w:themeFillTint="66"/>
             <w:vAlign w:val="bottom"/>
           </w:tcPr>
@@ -2873,6 +3019,10 @@
         <w:tc>
           <w:tcPr>
             <w:tcW w:w="943" w:type="dxa"/>
+            <w:tcBorders>
+              <w:top w:val="single" w:sz="24" w:space="0" w:color="auto"/>
+              <w:bottom w:val="single" w:sz="24" w:space="0" w:color="auto"/>
+            </w:tcBorders>
             <w:shd w:val="clear" w:color="auto" w:fill="B4C6E7" w:themeFill="accent1" w:themeFillTint="66"/>
             <w:vAlign w:val="bottom"/>
           </w:tcPr>
@@ -2894,6 +3044,10 @@
         <w:tc>
           <w:tcPr>
             <w:tcW w:w="836" w:type="dxa"/>
+            <w:tcBorders>
+              <w:top w:val="single" w:sz="24" w:space="0" w:color="auto"/>
+              <w:bottom w:val="single" w:sz="24" w:space="0" w:color="auto"/>
+            </w:tcBorders>
             <w:shd w:val="clear" w:color="auto" w:fill="B4C6E7" w:themeFill="accent1" w:themeFillTint="66"/>
             <w:vAlign w:val="bottom"/>
           </w:tcPr>
@@ -2915,6 +3069,10 @@
         <w:tc>
           <w:tcPr>
             <w:tcW w:w="907" w:type="dxa"/>
+            <w:tcBorders>
+              <w:top w:val="single" w:sz="24" w:space="0" w:color="auto"/>
+              <w:bottom w:val="single" w:sz="24" w:space="0" w:color="auto"/>
+            </w:tcBorders>
             <w:shd w:val="clear" w:color="auto" w:fill="B4C6E7" w:themeFill="accent1" w:themeFillTint="66"/>
             <w:vAlign w:val="bottom"/>
           </w:tcPr>
@@ -2936,6 +3094,10 @@
         <w:tc>
           <w:tcPr>
             <w:tcW w:w="853" w:type="dxa"/>
+            <w:tcBorders>
+              <w:top w:val="single" w:sz="24" w:space="0" w:color="auto"/>
+              <w:bottom w:val="single" w:sz="24" w:space="0" w:color="auto"/>
+            </w:tcBorders>
             <w:shd w:val="clear" w:color="auto" w:fill="B4C6E7" w:themeFill="accent1" w:themeFillTint="66"/>
             <w:vAlign w:val="bottom"/>
           </w:tcPr>
@@ -2957,6 +3119,10 @@
         <w:tc>
           <w:tcPr>
             <w:tcW w:w="981" w:type="dxa"/>
+            <w:tcBorders>
+              <w:top w:val="single" w:sz="24" w:space="0" w:color="auto"/>
+              <w:bottom w:val="single" w:sz="24" w:space="0" w:color="auto"/>
+            </w:tcBorders>
             <w:shd w:val="clear" w:color="auto" w:fill="B4C6E7" w:themeFill="accent1" w:themeFillTint="66"/>
             <w:vAlign w:val="bottom"/>
           </w:tcPr>
@@ -2978,6 +3144,11 @@
         <w:tc>
           <w:tcPr>
             <w:tcW w:w="941" w:type="dxa"/>
+            <w:tcBorders>
+              <w:top w:val="single" w:sz="24" w:space="0" w:color="auto"/>
+              <w:bottom w:val="single" w:sz="24" w:space="0" w:color="auto"/>
+              <w:right w:val="single" w:sz="24" w:space="0" w:color="auto"/>
+            </w:tcBorders>
             <w:shd w:val="clear" w:color="auto" w:fill="B4C6E7" w:themeFill="accent1" w:themeFillTint="66"/>
           </w:tcPr>
           <w:p>
@@ -3008,6 +3179,9 @@
         <w:tc>
           <w:tcPr>
             <w:tcW w:w="1386" w:type="dxa"/>
+            <w:tcBorders>
+              <w:top w:val="single" w:sz="24" w:space="0" w:color="auto"/>
+            </w:tcBorders>
             <w:shd w:val="clear" w:color="auto" w:fill="FFE599" w:themeFill="accent4" w:themeFillTint="66"/>
             <w:vAlign w:val="bottom"/>
           </w:tcPr>
@@ -3030,6 +3204,9 @@
         <w:tc>
           <w:tcPr>
             <w:tcW w:w="939" w:type="dxa"/>
+            <w:tcBorders>
+              <w:top w:val="single" w:sz="24" w:space="0" w:color="auto"/>
+            </w:tcBorders>
             <w:shd w:val="clear" w:color="auto" w:fill="FFE599" w:themeFill="accent4" w:themeFillTint="66"/>
             <w:vAlign w:val="bottom"/>
           </w:tcPr>
@@ -3051,6 +3228,9 @@
         <w:tc>
           <w:tcPr>
             <w:tcW w:w="819" w:type="dxa"/>
+            <w:tcBorders>
+              <w:top w:val="single" w:sz="24" w:space="0" w:color="auto"/>
+            </w:tcBorders>
             <w:shd w:val="clear" w:color="auto" w:fill="FFE599" w:themeFill="accent4" w:themeFillTint="66"/>
             <w:vAlign w:val="bottom"/>
           </w:tcPr>
@@ -3072,6 +3252,9 @@
         <w:tc>
           <w:tcPr>
             <w:tcW w:w="943" w:type="dxa"/>
+            <w:tcBorders>
+              <w:top w:val="single" w:sz="24" w:space="0" w:color="auto"/>
+            </w:tcBorders>
             <w:shd w:val="clear" w:color="auto" w:fill="FFE599" w:themeFill="accent4" w:themeFillTint="66"/>
             <w:vAlign w:val="bottom"/>
           </w:tcPr>
@@ -3093,6 +3276,9 @@
         <w:tc>
           <w:tcPr>
             <w:tcW w:w="908" w:type="dxa"/>
+            <w:tcBorders>
+              <w:top w:val="single" w:sz="24" w:space="0" w:color="auto"/>
+            </w:tcBorders>
             <w:shd w:val="clear" w:color="auto" w:fill="FFE599" w:themeFill="accent4" w:themeFillTint="66"/>
             <w:vAlign w:val="bottom"/>
           </w:tcPr>
@@ -3114,6 +3300,9 @@
         <w:tc>
           <w:tcPr>
             <w:tcW w:w="943" w:type="dxa"/>
+            <w:tcBorders>
+              <w:top w:val="single" w:sz="24" w:space="0" w:color="auto"/>
+            </w:tcBorders>
             <w:shd w:val="clear" w:color="auto" w:fill="FFE599" w:themeFill="accent4" w:themeFillTint="66"/>
             <w:vAlign w:val="bottom"/>
           </w:tcPr>
@@ -3135,6 +3324,9 @@
         <w:tc>
           <w:tcPr>
             <w:tcW w:w="836" w:type="dxa"/>
+            <w:tcBorders>
+              <w:top w:val="single" w:sz="24" w:space="0" w:color="auto"/>
+            </w:tcBorders>
             <w:shd w:val="clear" w:color="auto" w:fill="FFE599" w:themeFill="accent4" w:themeFillTint="66"/>
             <w:vAlign w:val="bottom"/>
           </w:tcPr>
@@ -3156,6 +3348,9 @@
         <w:tc>
           <w:tcPr>
             <w:tcW w:w="907" w:type="dxa"/>
+            <w:tcBorders>
+              <w:top w:val="single" w:sz="24" w:space="0" w:color="auto"/>
+            </w:tcBorders>
             <w:shd w:val="clear" w:color="auto" w:fill="FFE599" w:themeFill="accent4" w:themeFillTint="66"/>
             <w:vAlign w:val="bottom"/>
           </w:tcPr>
@@ -3177,6 +3372,9 @@
         <w:tc>
           <w:tcPr>
             <w:tcW w:w="853" w:type="dxa"/>
+            <w:tcBorders>
+              <w:top w:val="single" w:sz="24" w:space="0" w:color="auto"/>
+            </w:tcBorders>
             <w:shd w:val="clear" w:color="auto" w:fill="FFE599" w:themeFill="accent4" w:themeFillTint="66"/>
             <w:vAlign w:val="bottom"/>
           </w:tcPr>
@@ -3198,6 +3396,9 @@
         <w:tc>
           <w:tcPr>
             <w:tcW w:w="981" w:type="dxa"/>
+            <w:tcBorders>
+              <w:top w:val="single" w:sz="24" w:space="0" w:color="auto"/>
+            </w:tcBorders>
             <w:shd w:val="clear" w:color="auto" w:fill="FFE599" w:themeFill="accent4" w:themeFillTint="66"/>
             <w:vAlign w:val="bottom"/>
           </w:tcPr>
@@ -3219,6 +3420,9 @@
         <w:tc>
           <w:tcPr>
             <w:tcW w:w="941" w:type="dxa"/>
+            <w:tcBorders>
+              <w:top w:val="single" w:sz="24" w:space="0" w:color="auto"/>
+            </w:tcBorders>
             <w:shd w:val="clear" w:color="auto" w:fill="FFE599" w:themeFill="accent4" w:themeFillTint="66"/>
           </w:tcPr>
           <w:p>
@@ -3249,6 +3453,9 @@
         <w:tc>
           <w:tcPr>
             <w:tcW w:w="1386" w:type="dxa"/>
+            <w:tcBorders>
+              <w:bottom w:val="single" w:sz="24" w:space="0" w:color="auto"/>
+            </w:tcBorders>
             <w:shd w:val="clear" w:color="auto" w:fill="C5E0B3" w:themeFill="accent6" w:themeFillTint="66"/>
           </w:tcPr>
           <w:p>
@@ -3270,6 +3477,9 @@
         <w:tc>
           <w:tcPr>
             <w:tcW w:w="939" w:type="dxa"/>
+            <w:tcBorders>
+              <w:bottom w:val="single" w:sz="24" w:space="0" w:color="auto"/>
+            </w:tcBorders>
             <w:shd w:val="clear" w:color="auto" w:fill="C5E0B3" w:themeFill="accent6" w:themeFillTint="66"/>
           </w:tcPr>
           <w:p>
@@ -3292,6 +3502,9 @@
         <w:tc>
           <w:tcPr>
             <w:tcW w:w="819" w:type="dxa"/>
+            <w:tcBorders>
+              <w:bottom w:val="single" w:sz="24" w:space="0" w:color="auto"/>
+            </w:tcBorders>
             <w:shd w:val="clear" w:color="auto" w:fill="C5E0B3" w:themeFill="accent6" w:themeFillTint="66"/>
           </w:tcPr>
           <w:p>
@@ -3312,6 +3525,9 @@
         <w:tc>
           <w:tcPr>
             <w:tcW w:w="943" w:type="dxa"/>
+            <w:tcBorders>
+              <w:bottom w:val="single" w:sz="24" w:space="0" w:color="auto"/>
+            </w:tcBorders>
             <w:shd w:val="clear" w:color="auto" w:fill="C5E0B3" w:themeFill="accent6" w:themeFillTint="66"/>
           </w:tcPr>
           <w:p>
@@ -3332,6 +3548,9 @@
         <w:tc>
           <w:tcPr>
             <w:tcW w:w="908" w:type="dxa"/>
+            <w:tcBorders>
+              <w:bottom w:val="single" w:sz="24" w:space="0" w:color="auto"/>
+            </w:tcBorders>
             <w:shd w:val="clear" w:color="auto" w:fill="C5E0B3" w:themeFill="accent6" w:themeFillTint="66"/>
           </w:tcPr>
           <w:p>
@@ -3352,6 +3571,9 @@
         <w:tc>
           <w:tcPr>
             <w:tcW w:w="943" w:type="dxa"/>
+            <w:tcBorders>
+              <w:bottom w:val="single" w:sz="24" w:space="0" w:color="auto"/>
+            </w:tcBorders>
             <w:shd w:val="clear" w:color="auto" w:fill="C5E0B3" w:themeFill="accent6" w:themeFillTint="66"/>
           </w:tcPr>
           <w:p>
@@ -3372,6 +3594,9 @@
         <w:tc>
           <w:tcPr>
             <w:tcW w:w="836" w:type="dxa"/>
+            <w:tcBorders>
+              <w:bottom w:val="single" w:sz="24" w:space="0" w:color="auto"/>
+            </w:tcBorders>
             <w:shd w:val="clear" w:color="auto" w:fill="C5E0B3" w:themeFill="accent6" w:themeFillTint="66"/>
           </w:tcPr>
           <w:p>
@@ -3392,6 +3617,9 @@
         <w:tc>
           <w:tcPr>
             <w:tcW w:w="907" w:type="dxa"/>
+            <w:tcBorders>
+              <w:bottom w:val="single" w:sz="24" w:space="0" w:color="auto"/>
+            </w:tcBorders>
             <w:shd w:val="clear" w:color="auto" w:fill="C5E0B3" w:themeFill="accent6" w:themeFillTint="66"/>
           </w:tcPr>
           <w:p>
@@ -3412,6 +3640,9 @@
         <w:tc>
           <w:tcPr>
             <w:tcW w:w="853" w:type="dxa"/>
+            <w:tcBorders>
+              <w:bottom w:val="single" w:sz="24" w:space="0" w:color="auto"/>
+            </w:tcBorders>
             <w:shd w:val="clear" w:color="auto" w:fill="C5E0B3" w:themeFill="accent6" w:themeFillTint="66"/>
           </w:tcPr>
           <w:p>
@@ -3432,6 +3663,9 @@
         <w:tc>
           <w:tcPr>
             <w:tcW w:w="981" w:type="dxa"/>
+            <w:tcBorders>
+              <w:bottom w:val="single" w:sz="24" w:space="0" w:color="auto"/>
+            </w:tcBorders>
             <w:shd w:val="clear" w:color="auto" w:fill="C5E0B3" w:themeFill="accent6" w:themeFillTint="66"/>
           </w:tcPr>
           <w:p>
@@ -3452,6 +3686,9 @@
         <w:tc>
           <w:tcPr>
             <w:tcW w:w="941" w:type="dxa"/>
+            <w:tcBorders>
+              <w:bottom w:val="single" w:sz="24" w:space="0" w:color="auto"/>
+            </w:tcBorders>
             <w:shd w:val="clear" w:color="auto" w:fill="C5E0B3" w:themeFill="accent6" w:themeFillTint="66"/>
           </w:tcPr>
           <w:p>
@@ -3488,6 +3725,11 @@
         <w:tc>
           <w:tcPr>
             <w:tcW w:w="1386" w:type="dxa"/>
+            <w:tcBorders>
+              <w:top w:val="single" w:sz="24" w:space="0" w:color="auto"/>
+              <w:left w:val="single" w:sz="24" w:space="0" w:color="auto"/>
+              <w:bottom w:val="single" w:sz="24" w:space="0" w:color="auto"/>
+            </w:tcBorders>
             <w:shd w:val="clear" w:color="auto" w:fill="F7CAAC" w:themeFill="accent2" w:themeFillTint="66"/>
           </w:tcPr>
           <w:p>
@@ -3509,6 +3751,10 @@
         <w:tc>
           <w:tcPr>
             <w:tcW w:w="939" w:type="dxa"/>
+            <w:tcBorders>
+              <w:top w:val="single" w:sz="24" w:space="0" w:color="auto"/>
+              <w:bottom w:val="single" w:sz="24" w:space="0" w:color="auto"/>
+            </w:tcBorders>
             <w:shd w:val="clear" w:color="auto" w:fill="F7CAAC" w:themeFill="accent2" w:themeFillTint="66"/>
           </w:tcPr>
           <w:p>
@@ -3529,6 +3775,10 @@
         <w:tc>
           <w:tcPr>
             <w:tcW w:w="819" w:type="dxa"/>
+            <w:tcBorders>
+              <w:top w:val="single" w:sz="24" w:space="0" w:color="auto"/>
+              <w:bottom w:val="single" w:sz="24" w:space="0" w:color="auto"/>
+            </w:tcBorders>
             <w:shd w:val="clear" w:color="auto" w:fill="F7CAAC" w:themeFill="accent2" w:themeFillTint="66"/>
           </w:tcPr>
           <w:p>
@@ -3549,6 +3799,10 @@
         <w:tc>
           <w:tcPr>
             <w:tcW w:w="943" w:type="dxa"/>
+            <w:tcBorders>
+              <w:top w:val="single" w:sz="24" w:space="0" w:color="auto"/>
+              <w:bottom w:val="single" w:sz="24" w:space="0" w:color="auto"/>
+            </w:tcBorders>
             <w:shd w:val="clear" w:color="auto" w:fill="F7CAAC" w:themeFill="accent2" w:themeFillTint="66"/>
           </w:tcPr>
           <w:p>
@@ -3569,6 +3823,10 @@
         <w:tc>
           <w:tcPr>
             <w:tcW w:w="908" w:type="dxa"/>
+            <w:tcBorders>
+              <w:top w:val="single" w:sz="24" w:space="0" w:color="auto"/>
+              <w:bottom w:val="single" w:sz="24" w:space="0" w:color="auto"/>
+            </w:tcBorders>
             <w:shd w:val="clear" w:color="auto" w:fill="F7CAAC" w:themeFill="accent2" w:themeFillTint="66"/>
           </w:tcPr>
           <w:p>
@@ -3589,6 +3847,10 @@
         <w:tc>
           <w:tcPr>
             <w:tcW w:w="943" w:type="dxa"/>
+            <w:tcBorders>
+              <w:top w:val="single" w:sz="24" w:space="0" w:color="auto"/>
+              <w:bottom w:val="single" w:sz="24" w:space="0" w:color="auto"/>
+            </w:tcBorders>
             <w:shd w:val="clear" w:color="auto" w:fill="F7CAAC" w:themeFill="accent2" w:themeFillTint="66"/>
           </w:tcPr>
           <w:p>
@@ -3609,6 +3871,10 @@
         <w:tc>
           <w:tcPr>
             <w:tcW w:w="836" w:type="dxa"/>
+            <w:tcBorders>
+              <w:top w:val="single" w:sz="24" w:space="0" w:color="auto"/>
+              <w:bottom w:val="single" w:sz="24" w:space="0" w:color="auto"/>
+            </w:tcBorders>
             <w:shd w:val="clear" w:color="auto" w:fill="F7CAAC" w:themeFill="accent2" w:themeFillTint="66"/>
           </w:tcPr>
           <w:p>
@@ -3629,6 +3895,10 @@
         <w:tc>
           <w:tcPr>
             <w:tcW w:w="907" w:type="dxa"/>
+            <w:tcBorders>
+              <w:top w:val="single" w:sz="24" w:space="0" w:color="auto"/>
+              <w:bottom w:val="single" w:sz="24" w:space="0" w:color="auto"/>
+            </w:tcBorders>
             <w:shd w:val="clear" w:color="auto" w:fill="F7CAAC" w:themeFill="accent2" w:themeFillTint="66"/>
           </w:tcPr>
           <w:p>
@@ -3649,6 +3919,10 @@
         <w:tc>
           <w:tcPr>
             <w:tcW w:w="853" w:type="dxa"/>
+            <w:tcBorders>
+              <w:top w:val="single" w:sz="24" w:space="0" w:color="auto"/>
+              <w:bottom w:val="single" w:sz="24" w:space="0" w:color="auto"/>
+            </w:tcBorders>
             <w:shd w:val="clear" w:color="auto" w:fill="F7CAAC" w:themeFill="accent2" w:themeFillTint="66"/>
           </w:tcPr>
           <w:p>
@@ -3669,6 +3943,10 @@
         <w:tc>
           <w:tcPr>
             <w:tcW w:w="981" w:type="dxa"/>
+            <w:tcBorders>
+              <w:top w:val="single" w:sz="24" w:space="0" w:color="auto"/>
+              <w:bottom w:val="single" w:sz="24" w:space="0" w:color="auto"/>
+            </w:tcBorders>
             <w:shd w:val="clear" w:color="auto" w:fill="F7CAAC" w:themeFill="accent2" w:themeFillTint="66"/>
           </w:tcPr>
           <w:p>
@@ -3689,6 +3967,11 @@
         <w:tc>
           <w:tcPr>
             <w:tcW w:w="941" w:type="dxa"/>
+            <w:tcBorders>
+              <w:top w:val="single" w:sz="24" w:space="0" w:color="auto"/>
+              <w:bottom w:val="single" w:sz="24" w:space="0" w:color="auto"/>
+              <w:right w:val="single" w:sz="24" w:space="0" w:color="auto"/>
+            </w:tcBorders>
             <w:shd w:val="clear" w:color="auto" w:fill="F7CAAC" w:themeFill="accent2" w:themeFillTint="66"/>
           </w:tcPr>
           <w:p>
@@ -3717,6 +4000,11 @@
         <w:tc>
           <w:tcPr>
             <w:tcW w:w="1386" w:type="dxa"/>
+            <w:tcBorders>
+              <w:top w:val="single" w:sz="24" w:space="0" w:color="auto"/>
+              <w:left w:val="single" w:sz="24" w:space="0" w:color="auto"/>
+              <w:bottom w:val="single" w:sz="24" w:space="0" w:color="auto"/>
+            </w:tcBorders>
             <w:shd w:val="clear" w:color="auto" w:fill="BFBFBF" w:themeFill="background1" w:themeFillShade="BF"/>
             <w:vAlign w:val="bottom"/>
           </w:tcPr>
@@ -3741,6 +4029,10 @@
         <w:tc>
           <w:tcPr>
             <w:tcW w:w="939" w:type="dxa"/>
+            <w:tcBorders>
+              <w:top w:val="single" w:sz="24" w:space="0" w:color="auto"/>
+              <w:bottom w:val="single" w:sz="24" w:space="0" w:color="auto"/>
+            </w:tcBorders>
             <w:shd w:val="clear" w:color="auto" w:fill="BFBFBF" w:themeFill="background1" w:themeFillShade="BF"/>
             <w:vAlign w:val="bottom"/>
           </w:tcPr>
@@ -3763,6 +4055,10 @@
         <w:tc>
           <w:tcPr>
             <w:tcW w:w="819" w:type="dxa"/>
+            <w:tcBorders>
+              <w:top w:val="single" w:sz="24" w:space="0" w:color="auto"/>
+              <w:bottom w:val="single" w:sz="24" w:space="0" w:color="auto"/>
+            </w:tcBorders>
             <w:shd w:val="clear" w:color="auto" w:fill="BFBFBF" w:themeFill="background1" w:themeFillShade="BF"/>
             <w:vAlign w:val="bottom"/>
           </w:tcPr>
@@ -3785,6 +4081,10 @@
         <w:tc>
           <w:tcPr>
             <w:tcW w:w="943" w:type="dxa"/>
+            <w:tcBorders>
+              <w:top w:val="single" w:sz="24" w:space="0" w:color="auto"/>
+              <w:bottom w:val="single" w:sz="24" w:space="0" w:color="auto"/>
+            </w:tcBorders>
             <w:shd w:val="clear" w:color="auto" w:fill="BFBFBF" w:themeFill="background1" w:themeFillShade="BF"/>
             <w:vAlign w:val="bottom"/>
           </w:tcPr>
@@ -3803,6 +4103,10 @@
         <w:tc>
           <w:tcPr>
             <w:tcW w:w="908" w:type="dxa"/>
+            <w:tcBorders>
+              <w:top w:val="single" w:sz="24" w:space="0" w:color="auto"/>
+              <w:bottom w:val="single" w:sz="24" w:space="0" w:color="auto"/>
+            </w:tcBorders>
             <w:shd w:val="clear" w:color="auto" w:fill="BFBFBF" w:themeFill="background1" w:themeFillShade="BF"/>
             <w:vAlign w:val="bottom"/>
           </w:tcPr>
@@ -3821,6 +4125,10 @@
         <w:tc>
           <w:tcPr>
             <w:tcW w:w="943" w:type="dxa"/>
+            <w:tcBorders>
+              <w:top w:val="single" w:sz="24" w:space="0" w:color="auto"/>
+              <w:bottom w:val="single" w:sz="24" w:space="0" w:color="auto"/>
+            </w:tcBorders>
             <w:shd w:val="clear" w:color="auto" w:fill="BFBFBF" w:themeFill="background1" w:themeFillShade="BF"/>
             <w:vAlign w:val="bottom"/>
           </w:tcPr>
@@ -3839,6 +4147,10 @@
         <w:tc>
           <w:tcPr>
             <w:tcW w:w="836" w:type="dxa"/>
+            <w:tcBorders>
+              <w:top w:val="single" w:sz="24" w:space="0" w:color="auto"/>
+              <w:bottom w:val="single" w:sz="24" w:space="0" w:color="auto"/>
+            </w:tcBorders>
             <w:shd w:val="clear" w:color="auto" w:fill="BFBFBF" w:themeFill="background1" w:themeFillShade="BF"/>
             <w:vAlign w:val="bottom"/>
           </w:tcPr>
@@ -3861,6 +4173,10 @@
         <w:tc>
           <w:tcPr>
             <w:tcW w:w="907" w:type="dxa"/>
+            <w:tcBorders>
+              <w:top w:val="single" w:sz="24" w:space="0" w:color="auto"/>
+              <w:bottom w:val="single" w:sz="24" w:space="0" w:color="auto"/>
+            </w:tcBorders>
             <w:shd w:val="clear" w:color="auto" w:fill="BFBFBF" w:themeFill="background1" w:themeFillShade="BF"/>
             <w:vAlign w:val="bottom"/>
           </w:tcPr>
@@ -3879,6 +4195,10 @@
         <w:tc>
           <w:tcPr>
             <w:tcW w:w="853" w:type="dxa"/>
+            <w:tcBorders>
+              <w:top w:val="single" w:sz="24" w:space="0" w:color="auto"/>
+              <w:bottom w:val="single" w:sz="24" w:space="0" w:color="auto"/>
+            </w:tcBorders>
             <w:shd w:val="clear" w:color="auto" w:fill="BFBFBF" w:themeFill="background1" w:themeFillShade="BF"/>
             <w:vAlign w:val="bottom"/>
           </w:tcPr>
@@ -3901,6 +4221,10 @@
         <w:tc>
           <w:tcPr>
             <w:tcW w:w="981" w:type="dxa"/>
+            <w:tcBorders>
+              <w:top w:val="single" w:sz="24" w:space="0" w:color="auto"/>
+              <w:bottom w:val="single" w:sz="24" w:space="0" w:color="auto"/>
+            </w:tcBorders>
             <w:shd w:val="clear" w:color="auto" w:fill="BFBFBF" w:themeFill="background1" w:themeFillShade="BF"/>
             <w:vAlign w:val="bottom"/>
           </w:tcPr>
@@ -3923,6 +4247,11 @@
         <w:tc>
           <w:tcPr>
             <w:tcW w:w="941" w:type="dxa"/>
+            <w:tcBorders>
+              <w:top w:val="single" w:sz="24" w:space="0" w:color="auto"/>
+              <w:bottom w:val="single" w:sz="24" w:space="0" w:color="auto"/>
+              <w:right w:val="single" w:sz="24" w:space="0" w:color="auto"/>
+            </w:tcBorders>
             <w:shd w:val="clear" w:color="auto" w:fill="BFBFBF" w:themeFill="background1" w:themeFillShade="BF"/>
           </w:tcPr>
           <w:p>
@@ -5018,6 +5347,7 @@
               </w:rPr>
             </w:pPr>
             <w:r>
+              <w:lastRenderedPageBreak/>
               <w:t>SLFNMA06</w:t>
             </w:r>
           </w:p>
@@ -5123,7 +5453,6 @@
                 <w:color w:val="000000"/>
                 <w:lang w:eastAsia="en-GB"/>
               </w:rPr>
-              <w:lastRenderedPageBreak/>
               <w:t>SLFNMA07</w:t>
             </w:r>
           </w:p>
@@ -6232,6 +6561,7 @@
   <w:style w:type="character" w:default="1" w:styleId="DefaultParagraphFont">
     <w:name w:val="Default Paragraph Font"/>
     <w:uiPriority w:val="1"/>
+    <w:semiHidden/>
     <w:unhideWhenUsed/>
   </w:style>
   <w:style w:type="table" w:default="1" w:styleId="TableNormal">

</xml_diff>